<commit_message>
update demo 1 script
</commit_message>
<xml_diff>
--- a/Presentation/Drehbuch Demo 1.docx
+++ b/Presentation/Drehbuch Demo 1.docx
@@ -8,7 +8,14 @@
           <w:b/>
           <w:bCs/>
         </w:rPr>
-        <w:t>Charaktere:</w:t>
+        <w:t>C</w:t>
+      </w:r>
+      <w:r>
+        <w:rPr>
+          <w:b/>
+          <w:bCs/>
+        </w:rPr>
+        <w:t>haraktere:</w:t>
       </w:r>
     </w:p>
     <w:p>
@@ -50,7 +57,7 @@
     <w:p>
       <w:r>
         <w:pict w14:anchorId="4AAD6743">
-          <v:rect id="_x0000_i1049" style="width:0;height:1.5pt" o:hralign="center" o:hrstd="t" o:hr="t" fillcolor="#a0a0a0" stroked="f"/>
+          <v:rect id="_x0000_i1025" style="width:0;height:1.5pt" o:hralign="center" o:hrstd="t" o:hr="t" fillcolor="#a0a0a0" stroked="f"/>
         </w:pict>
       </w:r>
     </w:p>
@@ -75,137 +82,264 @@
           <w:i/>
           <w:iCs/>
         </w:rPr>
-        <w:t>(Luca sitzt entspannt an einem Tisch mit seinem Laptop. Dr. Keller stürmt herein, unter dem Arm ein riesiger, sichtlich mit Post-</w:t>
-      </w:r>
-      <w:proofErr w:type="spellStart"/>
+        <w:t>(Luca sitzt entspannt an einem Tisch mit seinem Laptop. Dr. Keller stürmt herein, unter dem Arm ein riesiger, sichtlich mit Post-its markierter Aktenordner.)</w:t>
+      </w:r>
+    </w:p>
+    <w:p>
+      <w:r>
+        <w:rPr>
+          <w:b/>
+          <w:bCs/>
+        </w:rPr>
+        <w:t>Dr. Keller:</w:t>
+      </w:r>
+      <w:r>
+        <w:t xml:space="preserve"> Herr Luca, grüezi! Entschuldigen Sie die Verspätung, aber meine Buchhaltung ist aktuell ein einziges Labyrinth. Ich verwalte mittlerweile über 600 Objekte und habe das Gefühl, ich verbringe mehr Zeit mit dem Suchen von Belegen als mit meinen Liegenschaften.</w:t>
+      </w:r>
+    </w:p>
+    <w:p>
+      <w:r>
+        <w:rPr>
+          <w:b/>
+          <w:bCs/>
+        </w:rPr>
+        <w:t>Luca:</w:t>
+      </w:r>
+      <w:r>
+        <w:t xml:space="preserve"> </w:t>
+      </w:r>
       <w:r>
         <w:rPr>
           <w:i/>
           <w:iCs/>
         </w:rPr>
-        <w:t>its</w:t>
-      </w:r>
-      <w:proofErr w:type="spellEnd"/>
+        <w:t>(steht auf, schüttelt die Hand)</w:t>
+      </w:r>
+      <w:r>
+        <w:t xml:space="preserve"> Grüezi, Dr. Keller! Kein Problem. Ich sehe, Sie haben das „analoge Backup“ </w:t>
+      </w:r>
+      <w:r>
+        <w:rPr>
+          <w:b/>
+          <w:bCs/>
+        </w:rPr>
+        <w:t>direkt</w:t>
+      </w:r>
+      <w:r>
+        <w:t xml:space="preserve"> </w:t>
+      </w:r>
+      <w:r>
+        <w:rPr>
+          <w:b/>
+          <w:bCs/>
+        </w:rPr>
+        <w:t>mitgebracht</w:t>
+      </w:r>
+      <w:r>
+        <w:t xml:space="preserve">. Aber keine Sorge, bei </w:t>
+      </w:r>
+      <w:r>
+        <w:rPr>
+          <w:b/>
+          <w:bCs/>
+        </w:rPr>
+        <w:t>GARAIO REM</w:t>
+      </w:r>
+      <w:r>
+        <w:t xml:space="preserve"> arbeiten wir hart daran, dass </w:t>
+      </w:r>
+      <w:r>
+        <w:rPr>
+          <w:b/>
+          <w:bCs/>
+        </w:rPr>
+        <w:t>dieser Ordner</w:t>
+      </w:r>
+      <w:r>
+        <w:t xml:space="preserve"> bald nur noch als </w:t>
+      </w:r>
+      <w:r>
+        <w:rPr>
+          <w:b/>
+          <w:bCs/>
+        </w:rPr>
+        <w:t>Briefbeschwerer</w:t>
+      </w:r>
+      <w:r>
+        <w:t xml:space="preserve"> dient.</w:t>
+      </w:r>
+    </w:p>
+    <w:p>
+      <w:r>
+        <w:rPr>
+          <w:b/>
+          <w:bCs/>
+        </w:rPr>
+        <w:t>Dr. Keller:</w:t>
+      </w:r>
+      <w:r>
+        <w:t xml:space="preserve"> Das sagen sie alle. Aber was genau macht GARAIO REM jetzt anders? Ich brauche keine Theorie, ich brauche Lösungen.</w:t>
+      </w:r>
+    </w:p>
+    <w:p>
+      <w:r>
+        <w:rPr>
+          <w:b/>
+          <w:bCs/>
+        </w:rPr>
+        <w:t>Luca:</w:t>
+      </w:r>
+      <w:r>
+        <w:t xml:space="preserve"> Ganz einfach: Wir sind das </w:t>
+      </w:r>
+      <w:r>
+        <w:rPr>
+          <w:b/>
+          <w:bCs/>
+        </w:rPr>
+        <w:t>digitale Herzstück</w:t>
+      </w:r>
+      <w:r>
+        <w:t xml:space="preserve"> der Schweizer Immobilienbewirtschaftung. Wir bieten ein </w:t>
+      </w:r>
+      <w:r>
+        <w:rPr>
+          <w:b/>
+          <w:bCs/>
+        </w:rPr>
+        <w:t>komplett</w:t>
+      </w:r>
+      <w:r>
+        <w:t xml:space="preserve"> webbasiertes ERP-System an, das von der </w:t>
+      </w:r>
+      <w:r>
+        <w:rPr>
+          <w:b/>
+          <w:bCs/>
+        </w:rPr>
+        <w:t>Buchhaltung</w:t>
+      </w:r>
+      <w:r>
+        <w:t xml:space="preserve"> </w:t>
+      </w:r>
+      <w:r>
+        <w:rPr>
+          <w:b/>
+          <w:bCs/>
+        </w:rPr>
+        <w:t>über</w:t>
+      </w:r>
+      <w:r>
+        <w:t xml:space="preserve"> das </w:t>
+      </w:r>
+      <w:r>
+        <w:rPr>
+          <w:b/>
+          <w:bCs/>
+        </w:rPr>
+        <w:t>Mahnwesen</w:t>
+      </w:r>
+      <w:r>
+        <w:t xml:space="preserve"> bis zur </w:t>
+      </w:r>
+      <w:r>
+        <w:rPr>
+          <w:b/>
+          <w:bCs/>
+        </w:rPr>
+        <w:t>Nebenkostenabrechnung</w:t>
+      </w:r>
+      <w:r>
+        <w:t xml:space="preserve"> alles automatisiert. Das Wichtigste für Sie: </w:t>
+      </w:r>
+      <w:r>
+        <w:rPr>
+          <w:b/>
+          <w:bCs/>
+        </w:rPr>
+        <w:t>Wir sind modular</w:t>
+      </w:r>
+      <w:r>
+        <w:t xml:space="preserve">. Sie </w:t>
+      </w:r>
+      <w:r>
+        <w:t>bezahlen</w:t>
+      </w:r>
+      <w:r>
+        <w:t xml:space="preserve"> nur das, was Sie </w:t>
+      </w:r>
+      <w:r>
+        <w:rPr>
+          <w:b/>
+          <w:bCs/>
+        </w:rPr>
+        <w:t>wirklich brauchen.</w:t>
+      </w:r>
+    </w:p>
+    <w:p>
+      <w:r>
+        <w:pict w14:anchorId="795F6308">
+          <v:rect id="_x0000_i1026" style="width:0;height:1.5pt" o:hralign="center" o:hrstd="t" o:hr="t" fillcolor="#a0a0a0" stroked="f"/>
+        </w:pict>
+      </w:r>
+    </w:p>
+    <w:p>
+      <w:pPr>
+        <w:rPr>
+          <w:b/>
+          <w:bCs/>
+        </w:rPr>
+      </w:pPr>
+      <w:r>
+        <w:rPr>
+          <w:b/>
+          <w:bCs/>
+        </w:rPr>
+        <w:t>Szene 2: Das Bedürfnis (The „Bundle“)</w:t>
+      </w:r>
+    </w:p>
+    <w:p>
+      <w:r>
+        <w:rPr>
+          <w:b/>
+          <w:bCs/>
+        </w:rPr>
+        <w:t>Dr. Keller:</w:t>
+      </w:r>
+      <w:r>
+        <w:t xml:space="preserve"> Gut, kommen wir zum Punkt. Mein Team verliert draussen bei den Besichtigungen den Überblick. Die Mängel werden auf Zettel geschrieben, die dann im Auto verschwinden. Und meine Stockwerkeigentümer wollen Transparenz – ich kann nicht jeden Abend um 22 Uhr noch PDF-Abrechnungen mailen.</w:t>
+      </w:r>
+    </w:p>
+    <w:p>
+      <w:r>
+        <w:rPr>
+          <w:b/>
+          <w:bCs/>
+        </w:rPr>
+        <w:t>Luca:</w:t>
+      </w:r>
+      <w:r>
+        <w:t xml:space="preserve"> </w:t>
+      </w:r>
       <w:r>
         <w:rPr>
           <w:i/>
           <w:iCs/>
         </w:rPr>
-        <w:t xml:space="preserve"> markierter Aktenordner.)</w:t>
-      </w:r>
-    </w:p>
-    <w:p>
-      <w:r>
-        <w:rPr>
-          <w:b/>
-          <w:bCs/>
-        </w:rPr>
-        <w:t>Dr. Keller:</w:t>
-      </w:r>
-      <w:r>
-        <w:t xml:space="preserve"> Herr Luca, grüezi! Entschuldigen Sie die Verspätung, aber meine Buchhaltung ist aktuell ein einziges Labyrinth. Ich verwalte mittlerweile über 600 Objekte und habe das Gefühl, ich verbringe mehr Zeit mit dem Suchen von Belegen als mit meinen Liegenschaften.</w:t>
-      </w:r>
-    </w:p>
-    <w:p>
-      <w:r>
-        <w:rPr>
-          <w:b/>
-          <w:bCs/>
-        </w:rPr>
-        <w:t>Luca:</w:t>
-      </w:r>
-      <w:r>
-        <w:t xml:space="preserve"> </w:t>
-      </w:r>
-      <w:r>
-        <w:rPr>
-          <w:i/>
-          <w:iCs/>
-        </w:rPr>
-        <w:t>(steht auf, schüttelt die Hand)</w:t>
-      </w:r>
-      <w:r>
-        <w:t xml:space="preserve"> Grüezi, Dr. Keller! Kein Problem. Ich sehe, Sie haben das „analoge Backup“ direkt mitgebracht. Aber keine Sorge, bei GARAIO REM arbeiten wir hart daran, dass dieser Ordner bald nur noch als Briefbeschwerer dient.</w:t>
-      </w:r>
-    </w:p>
-    <w:p>
-      <w:r>
-        <w:rPr>
-          <w:b/>
-          <w:bCs/>
-        </w:rPr>
-        <w:t>Dr. Keller:</w:t>
-      </w:r>
-      <w:r>
-        <w:t xml:space="preserve"> Das sagen sie alle. Aber was genau macht GARAIO REM jetzt anders? Ich brauche keine Theorie, ich brauche Lösungen.</w:t>
-      </w:r>
-    </w:p>
-    <w:p>
-      <w:r>
-        <w:rPr>
-          <w:b/>
-          <w:bCs/>
-        </w:rPr>
-        <w:t>Luca:</w:t>
-      </w:r>
-      <w:r>
-        <w:t xml:space="preserve"> Ganz einfach: Wir sind das digitale Herzstück der Schweizer Immobilienbewirtschaftung. Wir bieten ein komplett webbasiertes ERP-System an, das von der Buchhaltung über das Mahnwesen bis zur Nebenkostenabrechnung alles automatisiert. Das Wichtigste für Sie: Wir sind modular. Sie nutzen nur das, was Sie wirklich brauchen.</w:t>
-      </w:r>
-    </w:p>
-    <w:p>
-      <w:r>
-        <w:pict w14:anchorId="795F6308">
-          <v:rect id="_x0000_i1050" style="width:0;height:1.5pt" o:hralign="center" o:hrstd="t" o:hr="t" fillcolor="#a0a0a0" stroked="f"/>
-        </w:pict>
-      </w:r>
-    </w:p>
-    <w:p>
-      <w:pPr>
-        <w:rPr>
-          <w:b/>
-          <w:bCs/>
-        </w:rPr>
-      </w:pPr>
-      <w:r>
-        <w:rPr>
-          <w:b/>
-          <w:bCs/>
-        </w:rPr>
-        <w:t>Szene 2: Das Bedürfnis (The „Bundle“)</w:t>
-      </w:r>
-    </w:p>
-    <w:p>
-      <w:r>
-        <w:rPr>
-          <w:b/>
-          <w:bCs/>
-        </w:rPr>
-        <w:t>Dr. Keller:</w:t>
-      </w:r>
-      <w:r>
-        <w:t xml:space="preserve"> Gut, kommen wir zum Punkt. Mein Team verliert draussen bei den Besichtigungen den Überblick. Die Mängel werden auf Zettel geschrieben, die dann im Auto verschwinden. Und meine Stockwerkeigentümer wollen Transparenz – ich kann nicht jeden Abend um 22 Uhr noch PDF-Abrechnungen mailen.</w:t>
-      </w:r>
-    </w:p>
-    <w:p>
-      <w:r>
-        <w:rPr>
-          <w:b/>
-          <w:bCs/>
-        </w:rPr>
-        <w:t>Luca:</w:t>
-      </w:r>
-      <w:r>
-        <w:t xml:space="preserve"> </w:t>
-      </w:r>
-      <w:r>
-        <w:rPr>
-          <w:i/>
-          <w:iCs/>
-        </w:rPr>
         <w:t>(nickt verstehend)</w:t>
       </w:r>
       <w:r>
-        <w:t xml:space="preserve"> Ich höre da drei klare Bedürfnisse heraus. Ich schlage Ihnen unser </w:t>
+        <w:t xml:space="preserve"> Ich höre da </w:t>
+      </w:r>
+      <w:r>
+        <w:rPr>
+          <w:b/>
+          <w:bCs/>
+        </w:rPr>
+        <w:t xml:space="preserve">drei klare Bedürfnisse </w:t>
+      </w:r>
+      <w:r>
+        <w:t xml:space="preserve">heraus. Ich schlage Ihnen unser </w:t>
       </w:r>
       <w:r>
         <w:rPr>
@@ -215,7 +349,13 @@
         <w:t>„Smart-Management-Bundle“</w:t>
       </w:r>
       <w:r>
-        <w:t xml:space="preserve"> vor:</w:t>
+        <w:t xml:space="preserve"> vor</w:t>
+      </w:r>
+      <w:r>
+        <w:t>. Dies besteht aus 3 Teilen</w:t>
+      </w:r>
+      <w:r>
+        <w:t>:</w:t>
       </w:r>
     </w:p>
     <w:p>
@@ -233,7 +373,17 @@
         <w:t>GARAIO REM Basis:</w:t>
       </w:r>
       <w:r>
-        <w:t xml:space="preserve"> Damit Ihre Buchhaltung wieder im Takt schlägt.</w:t>
+        <w:t xml:space="preserve"> Damit Ihre </w:t>
+      </w:r>
+      <w:r>
+        <w:rPr>
+          <w:b/>
+          <w:bCs/>
+        </w:rPr>
+        <w:t>Buchhaltung</w:t>
+      </w:r>
+      <w:r>
+        <w:t xml:space="preserve"> wieder im Takt schlägt.</w:t>
       </w:r>
     </w:p>
     <w:p>
@@ -243,24 +393,35 @@
           <w:numId w:val="5"/>
         </w:numPr>
       </w:pPr>
-      <w:proofErr w:type="spellStart"/>
-      <w:r>
-        <w:rPr>
-          <w:b/>
-          <w:bCs/>
-        </w:rPr>
-        <w:t>OnSite</w:t>
-      </w:r>
-      <w:proofErr w:type="spellEnd"/>
-      <w:r>
-        <w:rPr>
-          <w:b/>
-          <w:bCs/>
-        </w:rPr>
-        <w:t>:</w:t>
-      </w:r>
-      <w:r>
-        <w:t xml:space="preserve"> Die App für Ihre Leute vor Ort. Mängel werden direkt am Handy erfasst und synchronisiert.</w:t>
+      <w:r>
+        <w:rPr>
+          <w:b/>
+          <w:bCs/>
+        </w:rPr>
+        <w:t xml:space="preserve">GARAIO REM </w:t>
+      </w:r>
+      <w:r>
+        <w:rPr>
+          <w:b/>
+          <w:bCs/>
+        </w:rPr>
+        <w:t>OnSite:</w:t>
+      </w:r>
+      <w:r>
+        <w:t xml:space="preserve"> </w:t>
+      </w:r>
+      <w:r>
+        <w:t xml:space="preserve">Die App für Ihre Leute vor Ort. Mängel werden </w:t>
+      </w:r>
+      <w:r>
+        <w:rPr>
+          <w:b/>
+          <w:bCs/>
+        </w:rPr>
+        <w:t>direkt am Handy</w:t>
+      </w:r>
+      <w:r>
+        <w:t xml:space="preserve"> erfasst und synchronisiert.</w:t>
       </w:r>
     </w:p>
     <w:p>
@@ -275,11 +436,32 @@
           <w:b/>
           <w:bCs/>
         </w:rPr>
-        <w:lastRenderedPageBreak/>
         <w:t>Das Eigentümerportal:</w:t>
       </w:r>
       <w:r>
-        <w:t xml:space="preserve"> Ihre Kunden loggen sich selbst ein und sehen ihre Zahlen. Weniger Telefonate für Sie, mehr Infos für die Eigentümer.</w:t>
+        <w:t xml:space="preserve"> Ihre Kunden </w:t>
+      </w:r>
+      <w:r>
+        <w:rPr>
+          <w:b/>
+          <w:bCs/>
+        </w:rPr>
+        <w:t>loggen sich selbst ein</w:t>
+      </w:r>
+      <w:r>
+        <w:t xml:space="preserve"> und sehen ihre Zahlen. Weniger Telefonate für Sie, mehr Infos für die Eigentümer</w:t>
+      </w:r>
+      <w:r>
+        <w:t>, mehr Geld für uns</w:t>
+      </w:r>
+      <w:r>
+        <w:t>.</w:t>
+      </w:r>
+      <w:r>
+        <w:t xml:space="preserve"> Win</w:t>
+      </w:r>
+      <w:r>
+        <w:t xml:space="preserve"> Win Win.</w:t>
       </w:r>
     </w:p>
     <w:p>
@@ -306,41 +488,96 @@
         <w:t xml:space="preserve"> Früher vielleicht. Aber heute zeige ich Ihnen</w:t>
       </w:r>
       <w:r>
-        <w:t xml:space="preserve"> unseren ganzen Stolz, </w:t>
-      </w:r>
-      <w:proofErr w:type="spellStart"/>
-      <w:r>
-        <w:t>nähmlich</w:t>
-      </w:r>
-      <w:proofErr w:type="spellEnd"/>
-      <w:r>
-        <w:t>, wie wir das mit unserer neuen Schnittstelle</w:t>
-      </w:r>
-      <w:r>
-        <w:t xml:space="preserve">, welche </w:t>
-      </w:r>
-      <w:proofErr w:type="gramStart"/>
-      <w:r>
-        <w:t xml:space="preserve">von der charmanten, </w:t>
-      </w:r>
-      <w:r>
-        <w:t>talentierter</w:t>
-      </w:r>
-      <w:r>
-        <w:t xml:space="preserve"> Gruppe</w:t>
-      </w:r>
-      <w:proofErr w:type="gramEnd"/>
-      <w:r>
-        <w:t xml:space="preserve"> des PSE 2026</w:t>
-      </w:r>
-      <w:r>
-        <w:t xml:space="preserve"> in Echtzeit lösen. Jeder Kunde kriegt bei uns seinen eigenen, dedizierten Server-Bereich. Schauen Sie mal...</w:t>
+        <w:t xml:space="preserve"> </w:t>
+      </w:r>
+      <w:r>
+        <w:rPr>
+          <w:b/>
+          <w:bCs/>
+        </w:rPr>
+        <w:t>unseren ganzen Stolz</w:t>
+      </w:r>
+      <w:r>
+        <w:t>. Die charmante, talentierte Gruppe des PSE 2026 zaubert uns gerade eine Schnittstelle, die genau dieses Problem</w:t>
+      </w:r>
+      <w:r>
+        <w:t xml:space="preserve"> löst</w:t>
+      </w:r>
+      <w:r>
+        <w:t>.</w:t>
+      </w:r>
+    </w:p>
+    <w:p>
+      <w:r>
+        <w:rPr>
+          <w:b/>
+          <w:bCs/>
+        </w:rPr>
+        <w:t>Dr. Keller:</w:t>
+      </w:r>
+      <w:r>
+        <w:t xml:space="preserve"> Ist das ein Aprilscherz? Studenten können das doch </w:t>
+      </w:r>
+      <w:r>
+        <w:t>n</w:t>
+      </w:r>
+      <w:r>
+        <w:t>icht!</w:t>
+      </w:r>
+    </w:p>
+    <w:p>
+      <w:r>
+        <w:rPr>
+          <w:b/>
+          <w:bCs/>
+        </w:rPr>
+        <w:t>Luca:</w:t>
+      </w:r>
+      <w:r>
+        <w:t xml:space="preserve"> Nein, nein, l</w:t>
+      </w:r>
+      <w:r>
+        <w:t>assen</w:t>
+      </w:r>
+      <w:r>
+        <w:t xml:space="preserve"> Sie es mich </w:t>
+      </w:r>
+      <w:r>
+        <w:rPr>
+          <w:rFonts w:ascii="Aptos" w:eastAsia="Aptos" w:hAnsi="Aptos" w:cs="Aptos"/>
+        </w:rPr>
+        <w:t>zeigen</w:t>
+      </w:r>
+      <w:r>
+        <w:rPr>
+          <w:rFonts w:ascii="Aptos" w:eastAsia="Aptos" w:hAnsi="Aptos" w:cs="Aptos"/>
+        </w:rPr>
+        <w:t>.</w:t>
+      </w:r>
+      <w:r>
+        <w:rPr>
+          <w:rFonts w:ascii="Aptos" w:eastAsia="Aptos" w:hAnsi="Aptos" w:cs="Aptos"/>
+        </w:rPr>
+        <w:t xml:space="preserve"> </w:t>
+      </w:r>
+      <w:r>
+        <w:t xml:space="preserve">Jeder Kunde kriegt bei uns seinen </w:t>
+      </w:r>
+      <w:r>
+        <w:rPr>
+          <w:b/>
+          <w:bCs/>
+        </w:rPr>
+        <w:t>eigenen,</w:t>
+      </w:r>
+      <w:r>
+        <w:t xml:space="preserve"> dedizierten Server-Bereich. Schauen Sie mal...</w:t>
       </w:r>
     </w:p>
     <w:p>
       <w:r>
         <w:pict w14:anchorId="5B67271C">
-          <v:rect id="_x0000_i1051" style="width:0;height:1.5pt" o:hralign="center" o:hrstd="t" o:hr="t" fillcolor="#a0a0a0" stroked="f"/>
+          <v:rect id="_x0000_i1027" style="width:0;height:1.5pt" o:hralign="center" o:hrstd="t" o:hr="t" fillcolor="#a0a0a0" stroked="f"/>
         </w:pict>
       </w:r>
     </w:p>
@@ -386,50 +623,41 @@
           <w:i/>
           <w:iCs/>
         </w:rPr>
-        <w:t xml:space="preserve"> sieht alles per </w:t>
-      </w:r>
-      <w:proofErr w:type="spellStart"/>
+        <w:t xml:space="preserve"> sieht alles per Beamer</w:t>
+      </w:r>
       <w:r>
         <w:rPr>
           <w:i/>
           <w:iCs/>
         </w:rPr>
-        <w:t>Beamer</w:t>
-      </w:r>
-      <w:proofErr w:type="spellEnd"/>
+        <w:t xml:space="preserve">. Hier startet </w:t>
+      </w:r>
       <w:r>
         <w:rPr>
           <w:i/>
           <w:iCs/>
         </w:rPr>
-        <w:t xml:space="preserve">. Hier startet </w:t>
+        <w:t>die</w:t>
       </w:r>
       <w:r>
         <w:rPr>
           <w:i/>
           <w:iCs/>
         </w:rPr>
-        <w:t>die</w:t>
+        <w:t xml:space="preserve"> Software-</w:t>
       </w:r>
       <w:r>
         <w:rPr>
           <w:i/>
           <w:iCs/>
         </w:rPr>
-        <w:t xml:space="preserve"> Software-</w:t>
+        <w:t>Demo</w:t>
       </w:r>
       <w:r>
         <w:rPr>
           <w:i/>
           <w:iCs/>
         </w:rPr>
-        <w:t>Demo</w:t>
-      </w:r>
-      <w:r>
-        <w:rPr>
-          <w:i/>
-          <w:iCs/>
-        </w:rPr>
         <w:t>.)</w:t>
       </w:r>
     </w:p>
@@ -444,30 +672,38 @@
       <w:r>
         <w:t xml:space="preserve"> Sehen Sie hier unser neues </w:t>
       </w:r>
-      <w:proofErr w:type="spellStart"/>
-      <w:r>
-        <w:t>Provisioning</w:t>
-      </w:r>
-      <w:proofErr w:type="spellEnd"/>
-      <w:r>
-        <w:t xml:space="preserve"> Tool</w:t>
-      </w:r>
-      <w:r>
-        <w:t xml:space="preserve">. Das </w:t>
-      </w:r>
-      <w:proofErr w:type="gramStart"/>
-      <w:r>
-        <w:t>ist sozusagen</w:t>
-      </w:r>
-      <w:proofErr w:type="gramEnd"/>
-      <w:r>
-        <w:t xml:space="preserve"> das Cockpit. </w:t>
-      </w:r>
-      <w:r>
-        <w:t xml:space="preserve">Hier kann ich alle Server sehen, welche im Betrieb sind und dazu deren Status. Sollte also etwas nicht in Ordnung sein, können wir diese ruckzuck fixen, da wir es sofort sehen. </w:t>
-      </w:r>
-      <w:r>
-        <w:t>Ich kann hier einfach einen neuen Server erstellen</w:t>
+      <w:r>
+        <w:t>Provisioning Tool</w:t>
+      </w:r>
+      <w:r>
+        <w:t xml:space="preserve">. Das ist sozusagen das Cockpit. </w:t>
+      </w:r>
+      <w:r>
+        <w:t xml:space="preserve">Hier kann ich alle Server sehen, welche im Betrieb sind und dazu deren Status. Sollte also </w:t>
+      </w:r>
+      <w:r>
+        <w:t xml:space="preserve">mit einem Server </w:t>
+      </w:r>
+      <w:r>
+        <w:t>etwas nicht in Ordnung sein, können wir diese</w:t>
+      </w:r>
+      <w:r>
+        <w:t>n</w:t>
+      </w:r>
+      <w:r>
+        <w:t xml:space="preserve"> ruckzuck fixen, da wir es sofort sehen. </w:t>
+      </w:r>
+      <w:r>
+        <w:t>Jetzt können wir Ihren Server hinzufügen, Dafür</w:t>
+      </w:r>
+      <w:r>
+        <w:t xml:space="preserve"> kann hier </w:t>
+      </w:r>
+      <w:r>
+        <w:t xml:space="preserve">hier </w:t>
+      </w:r>
+      <w:r>
+        <w:t>einfach einen neuen Server erstellen</w:t>
       </w:r>
       <w:r>
         <w:t xml:space="preserve">: </w:t>
@@ -480,159 +716,454 @@
         <w:t>„Keller-Immobilien-Cloud“</w:t>
       </w:r>
       <w:r>
-        <w:t xml:space="preserve">, verbinden ihn über die Interne </w:t>
-      </w:r>
-      <w:proofErr w:type="spellStart"/>
-      <w:r>
-        <w:t>url</w:t>
-      </w:r>
-      <w:proofErr w:type="spellEnd"/>
-      <w:r>
-        <w:t xml:space="preserve"> mit dem richtigen Server, aber fügen noch keine </w:t>
-      </w:r>
-      <w:r>
-        <w:t>Zusatzmodule</w:t>
-      </w:r>
-      <w:r>
-        <w:t xml:space="preserve"> hinzu</w:t>
+        <w:t>, verbinden ihn über die Interne url mit dem richtigen Server</w:t>
+      </w:r>
+      <w:r>
+        <w:t xml:space="preserve">. Wir fügen das Basismodul und </w:t>
+      </w:r>
+      <w:r>
+        <w:t>den OnSite</w:t>
+      </w:r>
+      <w:r>
+        <w:t xml:space="preserve"> service hinzu.</w:t>
+      </w:r>
+    </w:p>
+    <w:p>
+      <w:r>
+        <w:rPr>
+          <w:b/>
+          <w:bCs/>
+        </w:rPr>
+        <w:t>Dr. Keller:</w:t>
+      </w:r>
+      <w:r>
+        <w:t xml:space="preserve"> </w:t>
+      </w:r>
+      <w:r>
+        <w:t>Und was ist mit dem Eigentümerportal?</w:t>
+      </w:r>
+    </w:p>
+    <w:p>
+      <w:pPr>
+        <w:rPr>
+          <w:highlight w:val="yellow"/>
+        </w:rPr>
+      </w:pPr>
+      <w:r>
+        <w:rPr>
+          <w:b/>
+          <w:bCs/>
+        </w:rPr>
+        <w:t>Luca:</w:t>
+      </w:r>
+      <w:r>
+        <w:t xml:space="preserve"> </w:t>
+      </w:r>
+      <w:r>
+        <w:t xml:space="preserve">Dieses ist </w:t>
+      </w:r>
+      <w:r>
+        <w:t>brandneu</w:t>
+      </w:r>
+      <w:r>
+        <w:t xml:space="preserve"> und daher muss ich es zuerst erstellen</w:t>
+      </w:r>
+      <w:r>
+        <w:t>. Also navigieren wir zu den</w:t>
+      </w:r>
+      <w:r>
+        <w:t xml:space="preserve"> </w:t>
+      </w:r>
+      <w:r>
+        <w:rPr>
+          <w:b/>
+          <w:bCs/>
+        </w:rPr>
+        <w:t>„</w:t>
+      </w:r>
+      <w:r>
+        <w:rPr>
+          <w:b/>
+          <w:bCs/>
+        </w:rPr>
+        <w:t>Services</w:t>
+      </w:r>
+      <w:r>
+        <w:rPr>
+          <w:b/>
+          <w:bCs/>
+        </w:rPr>
+        <w:t>“</w:t>
       </w:r>
       <w:r>
         <w:t>.</w:t>
       </w:r>
-    </w:p>
-    <w:p>
-      <w:r>
-        <w:rPr>
-          <w:b/>
-          <w:bCs/>
-        </w:rPr>
-        <w:t>Dr. Keller:</w:t>
-      </w:r>
-      <w:r>
-        <w:t xml:space="preserve"> Wie ein Neubau ohne Innenausbau.</w:t>
-      </w:r>
-    </w:p>
-    <w:p>
-      <w:r>
-        <w:rPr>
-          <w:b/>
-          <w:bCs/>
+      <w:r>
+        <w:t xml:space="preserve"> Hier sieht man die Liste von Services, also Zusatzfunktionen, welche wir anbieten.</w:t>
+      </w:r>
+      <w:r>
+        <w:t xml:space="preserve"> </w:t>
+      </w:r>
+      <w:r>
+        <w:t>Anhand der Spalte Servers kann man deren Beliebtheit erkennen, was für uns intern sehr wichtig ist</w:t>
+      </w:r>
+      <w:r>
+        <w:t xml:space="preserve">. </w:t>
+      </w:r>
+      <w:r>
+        <w:t xml:space="preserve">Nun können wir einen neuen Service erstellen. Wir geben also «Eigentümerportal» ein und weisen dem Service </w:t>
+      </w:r>
+      <w:r>
+        <w:t xml:space="preserve">alle Server zu, die diesen Service bereitstellen sollen. </w:t>
+      </w:r>
+      <w:r>
+        <w:rPr>
+          <w:highlight w:val="yellow"/>
+        </w:rPr>
+        <w:t>Der Service wird jetzt automatisch auf Ihrem Server eingerichtet, so dass sie ohne Komplikation und Wartezeit sofort loslegen können.</w:t>
+      </w:r>
+      <w:r>
+        <w:rPr>
+          <w:highlight w:val="yellow"/>
+        </w:rPr>
+        <w:t xml:space="preserve"> Zur über</w:t>
+      </w:r>
+      <w:r>
+        <w:rPr>
+          <w:highlight w:val="yellow"/>
+        </w:rPr>
+        <w:t>prüfung gehe ich nochmal zu Servers und drücke auf Ihren Server</w:t>
+      </w:r>
+    </w:p>
+    <w:p>
+      <w:pPr>
+        <w:rPr>
+          <w:highlight w:val="magenta"/>
+        </w:rPr>
+      </w:pPr>
+      <w:r>
+        <w:rPr>
+          <w:b/>
+          <w:bCs/>
+          <w:highlight w:val="magenta"/>
+        </w:rPr>
+        <w:t>Dr. Keller</w:t>
+      </w:r>
+      <w:r>
+        <w:rPr>
+          <w:highlight w:val="magenta"/>
+        </w:rPr>
+        <w:t>: Schick!</w:t>
+      </w:r>
+      <w:r>
+        <w:t xml:space="preserve"> </w:t>
+      </w:r>
+    </w:p>
+    <w:p>
+      <w:pPr>
+        <w:spacing w:before="240" w:after="158" w:line="276" w:lineRule="auto"/>
+        <w:rPr>
+          <w:rFonts w:ascii="Aptos" w:eastAsia="Aptos" w:hAnsi="Aptos" w:cs="Aptos"/>
+          <w:highlight w:val="red"/>
+        </w:rPr>
+      </w:pPr>
+      <w:r>
+        <w:rPr>
+          <w:rFonts w:ascii="Aptos" w:eastAsia="Aptos" w:hAnsi="Aptos" w:cs="Aptos"/>
+          <w:b/>
+          <w:bCs/>
+          <w:highlight w:val="red"/>
+        </w:rPr>
+        <w:t xml:space="preserve">Sebastian: </w:t>
+      </w:r>
+      <w:r>
+        <w:rPr>
+          <w:rFonts w:ascii="Aptos" w:eastAsia="Aptos" w:hAnsi="Aptos" w:cs="Aptos"/>
+          <w:highlight w:val="red"/>
+        </w:rPr>
+        <w:t>(Keller’s Telefon klingelt mit einem schrillen Nokia-Klingelton)</w:t>
+      </w:r>
+    </w:p>
+    <w:p>
+      <w:pPr>
+        <w:spacing w:before="240" w:after="158" w:line="276" w:lineRule="auto"/>
+        <w:rPr>
+          <w:rFonts w:ascii="Aptos" w:eastAsia="Aptos" w:hAnsi="Aptos" w:cs="Aptos"/>
+        </w:rPr>
+      </w:pPr>
+      <w:r>
+        <w:rPr>
+          <w:rFonts w:ascii="Aptos" w:eastAsia="Aptos" w:hAnsi="Aptos" w:cs="Aptos"/>
+          <w:b/>
+        </w:rPr>
+        <w:t>Dr. Keller</w:t>
+      </w:r>
+      <w:r>
+        <w:rPr>
+          <w:rFonts w:ascii="Aptos" w:eastAsia="Aptos" w:hAnsi="Aptos" w:cs="Aptos"/>
+        </w:rPr>
+        <w:t xml:space="preserve">: </w:t>
+      </w:r>
+      <w:r>
+        <w:rPr>
+          <w:rFonts w:ascii="Aptos" w:eastAsia="Aptos" w:hAnsi="Aptos" w:cs="Aptos"/>
+        </w:rPr>
+        <w:t>Entschuldigung</w:t>
+      </w:r>
+      <w:r>
+        <w:rPr>
+          <w:rFonts w:ascii="Aptos" w:eastAsia="Aptos" w:hAnsi="Aptos" w:cs="Aptos"/>
+        </w:rPr>
+        <w:t>…</w:t>
+      </w:r>
+    </w:p>
+    <w:p>
+      <w:pPr>
+        <w:spacing w:before="240" w:after="158" w:line="276" w:lineRule="auto"/>
+        <w:rPr>
+          <w:rFonts w:ascii="Aptos" w:eastAsia="Aptos" w:hAnsi="Aptos" w:cs="Aptos"/>
+        </w:rPr>
+      </w:pPr>
+      <w:r>
+        <w:rPr>
+          <w:rFonts w:ascii="Aptos" w:eastAsia="Aptos" w:hAnsi="Aptos" w:cs="Aptos"/>
+        </w:rPr>
+        <w:t xml:space="preserve">(Keller </w:t>
+      </w:r>
+      <w:r>
+        <w:rPr>
+          <w:rFonts w:ascii="Aptos" w:eastAsia="Aptos" w:hAnsi="Aptos" w:cs="Aptos"/>
+        </w:rPr>
+        <w:t>sucht</w:t>
+      </w:r>
+      <w:r>
+        <w:rPr>
+          <w:rFonts w:ascii="Aptos" w:eastAsia="Aptos" w:hAnsi="Aptos" w:cs="Aptos"/>
+        </w:rPr>
+        <w:t xml:space="preserve"> nach seinem Klapp-Handy, nimmt es aus seiner Tasche und nimmt ab)</w:t>
+      </w:r>
+    </w:p>
+    <w:p>
+      <w:pPr>
+        <w:spacing w:before="240" w:after="158" w:line="276" w:lineRule="auto"/>
+        <w:rPr>
+          <w:rFonts w:ascii="Aptos" w:eastAsia="Aptos" w:hAnsi="Aptos" w:cs="Aptos"/>
+        </w:rPr>
+      </w:pPr>
+      <w:r>
+        <w:rPr>
+          <w:rFonts w:ascii="Aptos" w:eastAsia="Aptos" w:hAnsi="Aptos" w:cs="Aptos"/>
+          <w:b/>
+        </w:rPr>
+        <w:t>Dr. Keller</w:t>
+      </w:r>
+      <w:r>
+        <w:rPr>
+          <w:rFonts w:ascii="Aptos" w:eastAsia="Aptos" w:hAnsi="Aptos" w:cs="Aptos"/>
+        </w:rPr>
+        <w:t>: Keller?! Wie, die Bauarbeiter haben die Heizung an der Sidlerstrasse 10 ersetzt? Ich habe doch den Auftrag für die Länggasse 15 schriftlich gegeben! Dafür bezahle ich sicher nicht! Ich habe hier die Kopie. Einen Moment…</w:t>
+      </w:r>
+    </w:p>
+    <w:p>
+      <w:pPr>
+        <w:spacing w:before="240" w:after="158" w:line="276" w:lineRule="auto"/>
+        <w:rPr>
+          <w:rFonts w:ascii="Aptos" w:eastAsia="Aptos" w:hAnsi="Aptos" w:cs="Aptos"/>
+        </w:rPr>
+      </w:pPr>
+      <w:r>
+        <w:rPr>
+          <w:rFonts w:ascii="Aptos" w:eastAsia="Aptos" w:hAnsi="Aptos" w:cs="Aptos"/>
+        </w:rPr>
+        <w:t>(Keller hält das Handy mit der Schulter fest und durchsucht panisch seine Ordner</w:t>
+      </w:r>
+      <w:r>
+        <w:rPr>
+          <w:rFonts w:ascii="Aptos" w:eastAsia="Aptos" w:hAnsi="Aptos" w:cs="Aptos"/>
+        </w:rPr>
+        <w:t>.</w:t>
+      </w:r>
+      <w:r>
+        <w:rPr>
+          <w:rFonts w:ascii="Aptos" w:eastAsia="Aptos" w:hAnsi="Aptos" w:cs="Aptos"/>
+        </w:rPr>
+        <w:t>)</w:t>
+      </w:r>
+    </w:p>
+    <w:p>
+      <w:pPr>
+        <w:spacing w:before="240" w:after="158" w:line="276" w:lineRule="auto"/>
+        <w:rPr>
+          <w:rFonts w:ascii="Aptos" w:eastAsia="Aptos" w:hAnsi="Aptos" w:cs="Aptos"/>
+        </w:rPr>
+      </w:pPr>
+      <w:r>
+        <w:rPr>
+          <w:rFonts w:ascii="Aptos" w:eastAsia="Aptos" w:hAnsi="Aptos" w:cs="Aptos"/>
+          <w:b/>
+        </w:rPr>
+        <w:t>Dr. Keller</w:t>
+      </w:r>
+      <w:r>
+        <w:rPr>
+          <w:rFonts w:ascii="Aptos" w:eastAsia="Aptos" w:hAnsi="Aptos" w:cs="Aptos"/>
+        </w:rPr>
+        <w:t>: Ist wohl im Ordner in meinem Büro. Ich melde mich, sobald ich wieder im Büro bin.</w:t>
+      </w:r>
+    </w:p>
+    <w:p>
+      <w:pPr>
+        <w:spacing w:before="240" w:after="158" w:line="276" w:lineRule="auto"/>
+        <w:rPr>
+          <w:rFonts w:ascii="Aptos" w:eastAsia="Aptos" w:hAnsi="Aptos" w:cs="Aptos"/>
+        </w:rPr>
+      </w:pPr>
+      <w:r>
+        <w:rPr>
+          <w:rFonts w:ascii="Aptos" w:eastAsia="Aptos" w:hAnsi="Aptos" w:cs="Aptos"/>
+        </w:rPr>
+        <w:t>(Keller legt auf)</w:t>
+      </w:r>
+    </w:p>
+    <w:p>
+      <w:pPr>
+        <w:spacing w:before="240" w:after="158" w:line="276" w:lineRule="auto"/>
+        <w:rPr>
+          <w:rFonts w:ascii="Aptos" w:eastAsia="Aptos" w:hAnsi="Aptos" w:cs="Aptos"/>
+        </w:rPr>
+      </w:pPr>
+      <w:r>
+        <w:rPr>
+          <w:rFonts w:ascii="Aptos" w:eastAsia="Aptos" w:hAnsi="Aptos" w:cs="Aptos"/>
+          <w:b/>
+        </w:rPr>
+        <w:t>Luca</w:t>
+      </w:r>
+      <w:r>
+        <w:rPr>
+          <w:rFonts w:ascii="Aptos" w:eastAsia="Aptos" w:hAnsi="Aptos" w:cs="Aptos"/>
+        </w:rPr>
+        <w:t>: So ein Missverständnis kann bei uns nicht passieren, denn dafür haben wir die Provision Log Entries. Hier wird jede einzelne Änderung dokumentiert. Sehen Sie, hier steht Service «</w:t>
+      </w:r>
+      <w:r>
+        <w:rPr>
+          <w:rFonts w:ascii="Aptos" w:eastAsia="Aptos" w:hAnsi="Aptos" w:cs="Aptos"/>
+        </w:rPr>
+        <w:t>Eigentümerportal</w:t>
+      </w:r>
+      <w:r>
+        <w:rPr>
+          <w:rFonts w:ascii="Aptos" w:eastAsia="Aptos" w:hAnsi="Aptos" w:cs="Aptos"/>
+        </w:rPr>
+        <w:t>» wurde durch «Luca» zum Server «Keller-Immobilien-Cloud» hinzugefügt. So können wir immer genau nachvollziehen, wer was verändert hat.</w:t>
+      </w:r>
+    </w:p>
+    <w:p>
+      <w:pPr>
+        <w:spacing w:before="240" w:after="158" w:line="276" w:lineRule="auto"/>
+        <w:rPr>
+          <w:rFonts w:ascii="Aptos" w:eastAsia="Aptos" w:hAnsi="Aptos" w:cs="Aptos"/>
+        </w:rPr>
+      </w:pPr>
+      <w:r>
+        <w:rPr>
+          <w:rFonts w:ascii="Aptos" w:eastAsia="Aptos" w:hAnsi="Aptos" w:cs="Aptos"/>
+          <w:b/>
+        </w:rPr>
+        <w:t>Dr. Keller</w:t>
+      </w:r>
+      <w:r>
+        <w:rPr>
+          <w:rFonts w:ascii="Aptos" w:eastAsia="Aptos" w:hAnsi="Aptos" w:cs="Aptos"/>
+        </w:rPr>
+        <w:t xml:space="preserve">: Ja, das wäre jetzt mit der Heizung auch hilfreich gewesen… Und wie verwende </w:t>
+      </w:r>
+      <w:r>
+        <w:rPr>
+          <w:rFonts w:ascii="Aptos" w:eastAsia="Aptos" w:hAnsi="Aptos" w:cs="Aptos"/>
+        </w:rPr>
+        <w:t>ich jetzt</w:t>
+      </w:r>
+      <w:r>
+        <w:rPr>
+          <w:rFonts w:ascii="Aptos" w:eastAsia="Aptos" w:hAnsi="Aptos" w:cs="Aptos"/>
+        </w:rPr>
+        <w:t xml:space="preserve"> </w:t>
+      </w:r>
+      <w:r>
+        <w:rPr>
+          <w:rFonts w:ascii="Aptos" w:eastAsia="Aptos" w:hAnsi="Aptos" w:cs="Aptos"/>
+        </w:rPr>
+        <w:t>Garaio REM?</w:t>
+      </w:r>
+    </w:p>
+    <w:p>
+      <w:pPr>
+        <w:spacing w:before="240" w:after="158" w:line="276" w:lineRule="auto"/>
+      </w:pPr>
+      <w:r>
+        <w:rPr>
+          <w:rFonts w:ascii="Aptos" w:eastAsia="Aptos" w:hAnsi="Aptos" w:cs="Aptos"/>
+          <w:b/>
         </w:rPr>
         <w:t>Luca:</w:t>
       </w:r>
       <w:r>
+        <w:rPr>
+          <w:rFonts w:ascii="Aptos" w:eastAsia="Aptos" w:hAnsi="Aptos" w:cs="Aptos"/>
+        </w:rPr>
+        <w:t xml:space="preserve"> Nun ist alles bereit für Sie!</w:t>
+      </w:r>
+      <w:r>
+        <w:rPr>
+          <w:rFonts w:ascii="Aptos" w:eastAsia="Aptos" w:hAnsi="Aptos" w:cs="Aptos"/>
+        </w:rPr>
         <w:t xml:space="preserve"> </w:t>
       </w:r>
       <w:r>
-        <w:rPr>
-          <w:i/>
-          <w:iCs/>
-        </w:rPr>
-        <w:t>(tippt auf der Tastatur / zeigt die UI)</w:t>
-      </w:r>
-      <w:r>
-        <w:t xml:space="preserve"> Exakt. Jetzt klicke ich hier auf </w:t>
-      </w:r>
-      <w:r>
-        <w:rPr>
-          <w:b/>
-          <w:bCs/>
-        </w:rPr>
-        <w:t>„</w:t>
-      </w:r>
-      <w:r>
-        <w:rPr>
-          <w:b/>
-          <w:bCs/>
-        </w:rPr>
-        <w:t>Services</w:t>
-      </w:r>
-      <w:r>
-        <w:rPr>
-          <w:b/>
-          <w:bCs/>
-        </w:rPr>
-        <w:t>“</w:t>
-      </w:r>
-      <w:r>
-        <w:t>.</w:t>
-      </w:r>
-      <w:r>
-        <w:t xml:space="preserve"> Hier sieht man die Liste von Services, also Zusatzfunktionen, welche wir anbieten.</w:t>
-      </w:r>
-      <w:r>
-        <w:t xml:space="preserve"> </w:t>
-      </w:r>
-      <w:r>
-        <w:t xml:space="preserve">Anhand der Spalte Servers kann man deren Beliebtheit erkennen, was für uns intern sehr wichtig ist. Klicken wir nun beispielsweise auf </w:t>
-      </w:r>
-      <w:proofErr w:type="spellStart"/>
-      <w:r>
-        <w:t>OnSite</w:t>
-      </w:r>
-      <w:proofErr w:type="spellEnd"/>
-      <w:r>
-        <w:t>, welches ich Ihnen empfohlen habe. Nun kann ich diesen Service bearbeiten und ihrem Server zuteilen. Der Service wird jetzt automatisch auf Ihrem Server eingerichtet, so dass sie ohne Komplikation und Wartezeit sofort loslegen können.</w:t>
-      </w:r>
-    </w:p>
-    <w:p>
-      <w:r>
-        <w:rPr>
-          <w:b/>
-          <w:bCs/>
-        </w:rPr>
-        <w:t>Dr. Keller</w:t>
-      </w:r>
-      <w:r>
-        <w:t xml:space="preserve">: Schick! </w:t>
-      </w:r>
-    </w:p>
-    <w:p>
-      <w:pPr>
-        <w:rPr>
-          <w:color w:val="FF0000"/>
-        </w:rPr>
-      </w:pPr>
-      <w:r>
-        <w:rPr>
-          <w:color w:val="FF0000"/>
-        </w:rPr>
-        <w:t xml:space="preserve">(Noch Irgendwas zu </w:t>
-      </w:r>
-      <w:proofErr w:type="spellStart"/>
-      <w:r>
-        <w:rPr>
-          <w:color w:val="FF0000"/>
-        </w:rPr>
-        <w:t>ProvisionLogEntries</w:t>
-      </w:r>
-      <w:proofErr w:type="spellEnd"/>
-      <w:r>
-        <w:rPr>
-          <w:color w:val="FF0000"/>
-        </w:rPr>
-        <w:t xml:space="preserve"> einbauen)</w:t>
-      </w:r>
-    </w:p>
-    <w:p>
-      <w:r>
-        <w:rPr>
-          <w:b/>
-          <w:bCs/>
-        </w:rPr>
-        <w:t>Luca:</w:t>
-      </w:r>
-      <w:r>
-        <w:t xml:space="preserve"> Und... fertig! Wenn Sie jetzt Ihr Tablet zücken, sind die Services auf Ihrem Server aktiv. Keine manuelle Installation, kein Warten auf den Support.</w:t>
-      </w:r>
-      <w:r>
-        <w:t xml:space="preserve"> Dies ist alles möglich, sobald die charmante, talentierte Gruppe des PSE 2026 ihr Projekt beendet hat. Momentan besteht einfach das frontend und die Datenbank, aber noch keine Verbindungen zu den Services und den Servern</w:t>
+        <w:t>Wenn Sie jetzt Ihr Tablet zücken, sind die Services auf Ihrem Server aktiv. Keine manuelle Installation, kein Warten auf den Support.</w:t>
+      </w:r>
+      <w:r>
+        <w:t xml:space="preserve"> Dies </w:t>
+      </w:r>
+      <w:r>
+        <w:t>wird</w:t>
+      </w:r>
+      <w:r>
+        <w:t xml:space="preserve"> alles möglich</w:t>
+      </w:r>
+      <w:r>
+        <w:t xml:space="preserve"> sein</w:t>
+      </w:r>
+      <w:r>
+        <w:t xml:space="preserve">, sobald die charmante, talentierte Gruppe des PSE 2026 ihr Projekt beendet hat. Momentan </w:t>
+      </w:r>
+      <w:r>
+        <w:rPr>
+          <w:rFonts w:ascii="Aptos" w:eastAsia="Aptos" w:hAnsi="Aptos" w:cs="Aptos"/>
+        </w:rPr>
+        <w:t>bestehen</w:t>
+      </w:r>
+      <w:r>
+        <w:t xml:space="preserve"> einfach das </w:t>
+      </w:r>
+      <w:r>
+        <w:rPr>
+          <w:rFonts w:ascii="Aptos" w:eastAsia="Aptos" w:hAnsi="Aptos" w:cs="Aptos"/>
+        </w:rPr>
+        <w:t>Frontend</w:t>
+      </w:r>
+      <w:r>
+        <w:t xml:space="preserve"> und die Datenbank, aber noch keine Verbindungen zu den Services und den Servern</w:t>
+      </w:r>
+      <w:r>
+        <w:t xml:space="preserve"> von GARAIO</w:t>
       </w:r>
     </w:p>
     <w:p>
       <w:r>
         <w:pict w14:anchorId="1F544B18">
-          <v:rect id="_x0000_i1052" style="width:0;height:1.5pt" o:hralign="center" o:hrstd="t" o:hr="t" fillcolor="#a0a0a0" stroked="f"/>
+          <v:rect id="_x0000_i1028" style="width:0;height:1.5pt" o:hralign="center" o:hrstd="t" o:hr="t" fillcolor="#a0a0a0" stroked="f"/>
         </w:pict>
       </w:r>
     </w:p>
@@ -657,7 +1188,6 @@
           <w:b/>
           <w:bCs/>
         </w:rPr>
-        <w:lastRenderedPageBreak/>
         <w:t>Dr. Keller:</w:t>
       </w:r>
       <w:r>
@@ -1857,15 +2387,15 @@
     <w:lsdException w:name="Unresolved Mention" w:semiHidden="1" w:unhideWhenUsed="1"/>
     <w:lsdException w:name="Smart Link" w:semiHidden="1" w:unhideWhenUsed="1"/>
   </w:latentStyles>
-  <w:style w:type="paragraph" w:default="1" w:styleId="Standard">
+  <w:style w:type="paragraph" w:default="1" w:styleId="Normal">
     <w:name w:val="Normal"/>
     <w:qFormat/>
   </w:style>
-  <w:style w:type="paragraph" w:styleId="berschrift1">
+  <w:style w:type="paragraph" w:styleId="Heading1">
     <w:name w:val="heading 1"/>
-    <w:basedOn w:val="Standard"/>
-    <w:next w:val="Standard"/>
-    <w:link w:val="berschrift1Zchn"/>
+    <w:basedOn w:val="Normal"/>
+    <w:next w:val="Normal"/>
+    <w:link w:val="Heading1Char"/>
     <w:uiPriority w:val="9"/>
     <w:qFormat/>
     <w:rsid w:val="00FA2433"/>
@@ -1882,11 +2412,11 @@
       <w:szCs w:val="40"/>
     </w:rPr>
   </w:style>
-  <w:style w:type="paragraph" w:styleId="berschrift2">
+  <w:style w:type="paragraph" w:styleId="Heading2">
     <w:name w:val="heading 2"/>
-    <w:basedOn w:val="Standard"/>
-    <w:next w:val="Standard"/>
-    <w:link w:val="berschrift2Zchn"/>
+    <w:basedOn w:val="Normal"/>
+    <w:next w:val="Normal"/>
+    <w:link w:val="Heading2Char"/>
     <w:uiPriority w:val="9"/>
     <w:semiHidden/>
     <w:unhideWhenUsed/>
@@ -1905,11 +2435,11 @@
       <w:szCs w:val="32"/>
     </w:rPr>
   </w:style>
-  <w:style w:type="paragraph" w:styleId="berschrift3">
+  <w:style w:type="paragraph" w:styleId="Heading3">
     <w:name w:val="heading 3"/>
-    <w:basedOn w:val="Standard"/>
-    <w:next w:val="Standard"/>
-    <w:link w:val="berschrift3Zchn"/>
+    <w:basedOn w:val="Normal"/>
+    <w:next w:val="Normal"/>
+    <w:link w:val="Heading3Char"/>
     <w:uiPriority w:val="9"/>
     <w:semiHidden/>
     <w:unhideWhenUsed/>
@@ -1928,11 +2458,11 @@
       <w:szCs w:val="28"/>
     </w:rPr>
   </w:style>
-  <w:style w:type="paragraph" w:styleId="berschrift4">
+  <w:style w:type="paragraph" w:styleId="Heading4">
     <w:name w:val="heading 4"/>
-    <w:basedOn w:val="Standard"/>
-    <w:next w:val="Standard"/>
-    <w:link w:val="berschrift4Zchn"/>
+    <w:basedOn w:val="Normal"/>
+    <w:next w:val="Normal"/>
+    <w:link w:val="Heading4Char"/>
     <w:uiPriority w:val="9"/>
     <w:semiHidden/>
     <w:unhideWhenUsed/>
@@ -1951,11 +2481,11 @@
       <w:color w:val="0F4761" w:themeColor="accent1" w:themeShade="BF"/>
     </w:rPr>
   </w:style>
-  <w:style w:type="paragraph" w:styleId="berschrift5">
+  <w:style w:type="paragraph" w:styleId="Heading5">
     <w:name w:val="heading 5"/>
-    <w:basedOn w:val="Standard"/>
-    <w:next w:val="Standard"/>
-    <w:link w:val="berschrift5Zchn"/>
+    <w:basedOn w:val="Normal"/>
+    <w:next w:val="Normal"/>
+    <w:link w:val="Heading5Char"/>
     <w:uiPriority w:val="9"/>
     <w:semiHidden/>
     <w:unhideWhenUsed/>
@@ -1972,11 +2502,11 @@
       <w:color w:val="0F4761" w:themeColor="accent1" w:themeShade="BF"/>
     </w:rPr>
   </w:style>
-  <w:style w:type="paragraph" w:styleId="berschrift6">
+  <w:style w:type="paragraph" w:styleId="Heading6">
     <w:name w:val="heading 6"/>
-    <w:basedOn w:val="Standard"/>
-    <w:next w:val="Standard"/>
-    <w:link w:val="berschrift6Zchn"/>
+    <w:basedOn w:val="Normal"/>
+    <w:next w:val="Normal"/>
+    <w:link w:val="Heading6Char"/>
     <w:uiPriority w:val="9"/>
     <w:semiHidden/>
     <w:unhideWhenUsed/>
@@ -1995,11 +2525,11 @@
       <w:color w:val="595959" w:themeColor="text1" w:themeTint="A6"/>
     </w:rPr>
   </w:style>
-  <w:style w:type="paragraph" w:styleId="berschrift7">
+  <w:style w:type="paragraph" w:styleId="Heading7">
     <w:name w:val="heading 7"/>
-    <w:basedOn w:val="Standard"/>
-    <w:next w:val="Standard"/>
-    <w:link w:val="berschrift7Zchn"/>
+    <w:basedOn w:val="Normal"/>
+    <w:next w:val="Normal"/>
+    <w:link w:val="Heading7Char"/>
     <w:uiPriority w:val="9"/>
     <w:semiHidden/>
     <w:unhideWhenUsed/>
@@ -2016,11 +2546,11 @@
       <w:color w:val="595959" w:themeColor="text1" w:themeTint="A6"/>
     </w:rPr>
   </w:style>
-  <w:style w:type="paragraph" w:styleId="berschrift8">
+  <w:style w:type="paragraph" w:styleId="Heading8">
     <w:name w:val="heading 8"/>
-    <w:basedOn w:val="Standard"/>
-    <w:next w:val="Standard"/>
-    <w:link w:val="berschrift8Zchn"/>
+    <w:basedOn w:val="Normal"/>
+    <w:next w:val="Normal"/>
+    <w:link w:val="Heading8Char"/>
     <w:uiPriority w:val="9"/>
     <w:semiHidden/>
     <w:unhideWhenUsed/>
@@ -2039,11 +2569,11 @@
       <w:color w:val="272727" w:themeColor="text1" w:themeTint="D8"/>
     </w:rPr>
   </w:style>
-  <w:style w:type="paragraph" w:styleId="berschrift9">
+  <w:style w:type="paragraph" w:styleId="Heading9">
     <w:name w:val="heading 9"/>
-    <w:basedOn w:val="Standard"/>
-    <w:next w:val="Standard"/>
-    <w:link w:val="berschrift9Zchn"/>
+    <w:basedOn w:val="Normal"/>
+    <w:next w:val="Normal"/>
+    <w:link w:val="Heading9Char"/>
     <w:uiPriority w:val="9"/>
     <w:semiHidden/>
     <w:unhideWhenUsed/>
@@ -2060,12 +2590,13 @@
       <w:color w:val="272727" w:themeColor="text1" w:themeTint="D8"/>
     </w:rPr>
   </w:style>
-  <w:style w:type="character" w:default="1" w:styleId="Absatz-Standardschriftart">
+  <w:style w:type="character" w:default="1" w:styleId="DefaultParagraphFont">
     <w:name w:val="Default Paragraph Font"/>
     <w:uiPriority w:val="1"/>
+    <w:semiHidden/>
     <w:unhideWhenUsed/>
   </w:style>
-  <w:style w:type="table" w:default="1" w:styleId="NormaleTabelle">
+  <w:style w:type="table" w:default="1" w:styleId="TableNormal">
     <w:name w:val="Normal Table"/>
     <w:uiPriority w:val="99"/>
     <w:semiHidden/>
@@ -2080,16 +2611,16 @@
       </w:tblCellMar>
     </w:tblPr>
   </w:style>
-  <w:style w:type="numbering" w:default="1" w:styleId="KeineListe">
+  <w:style w:type="numbering" w:default="1" w:styleId="NoList">
     <w:name w:val="No List"/>
     <w:uiPriority w:val="99"/>
     <w:semiHidden/>
     <w:unhideWhenUsed/>
   </w:style>
-  <w:style w:type="character" w:customStyle="1" w:styleId="berschrift1Zchn">
-    <w:name w:val="Überschrift 1 Zchn"/>
-    <w:basedOn w:val="Absatz-Standardschriftart"/>
-    <w:link w:val="berschrift1"/>
+  <w:style w:type="character" w:customStyle="1" w:styleId="Heading1Char">
+    <w:name w:val="Heading 1 Char"/>
+    <w:basedOn w:val="DefaultParagraphFont"/>
+    <w:link w:val="Heading1"/>
     <w:uiPriority w:val="9"/>
     <w:rsid w:val="00FA2433"/>
     <w:rPr>
@@ -2099,10 +2630,10 @@
       <w:szCs w:val="40"/>
     </w:rPr>
   </w:style>
-  <w:style w:type="character" w:customStyle="1" w:styleId="berschrift2Zchn">
-    <w:name w:val="Überschrift 2 Zchn"/>
-    <w:basedOn w:val="Absatz-Standardschriftart"/>
-    <w:link w:val="berschrift2"/>
+  <w:style w:type="character" w:customStyle="1" w:styleId="Heading2Char">
+    <w:name w:val="Heading 2 Char"/>
+    <w:basedOn w:val="DefaultParagraphFont"/>
+    <w:link w:val="Heading2"/>
     <w:uiPriority w:val="9"/>
     <w:semiHidden/>
     <w:rsid w:val="00FA2433"/>
@@ -2113,10 +2644,10 @@
       <w:szCs w:val="32"/>
     </w:rPr>
   </w:style>
-  <w:style w:type="character" w:customStyle="1" w:styleId="berschrift3Zchn">
-    <w:name w:val="Überschrift 3 Zchn"/>
-    <w:basedOn w:val="Absatz-Standardschriftart"/>
-    <w:link w:val="berschrift3"/>
+  <w:style w:type="character" w:customStyle="1" w:styleId="Heading3Char">
+    <w:name w:val="Heading 3 Char"/>
+    <w:basedOn w:val="DefaultParagraphFont"/>
+    <w:link w:val="Heading3"/>
     <w:uiPriority w:val="9"/>
     <w:semiHidden/>
     <w:rsid w:val="00FA2433"/>
@@ -2127,10 +2658,10 @@
       <w:szCs w:val="28"/>
     </w:rPr>
   </w:style>
-  <w:style w:type="character" w:customStyle="1" w:styleId="berschrift4Zchn">
-    <w:name w:val="Überschrift 4 Zchn"/>
-    <w:basedOn w:val="Absatz-Standardschriftart"/>
-    <w:link w:val="berschrift4"/>
+  <w:style w:type="character" w:customStyle="1" w:styleId="Heading4Char">
+    <w:name w:val="Heading 4 Char"/>
+    <w:basedOn w:val="DefaultParagraphFont"/>
+    <w:link w:val="Heading4"/>
     <w:uiPriority w:val="9"/>
     <w:semiHidden/>
     <w:rsid w:val="00FA2433"/>
@@ -2141,10 +2672,10 @@
       <w:color w:val="0F4761" w:themeColor="accent1" w:themeShade="BF"/>
     </w:rPr>
   </w:style>
-  <w:style w:type="character" w:customStyle="1" w:styleId="berschrift5Zchn">
-    <w:name w:val="Überschrift 5 Zchn"/>
-    <w:basedOn w:val="Absatz-Standardschriftart"/>
-    <w:link w:val="berschrift5"/>
+  <w:style w:type="character" w:customStyle="1" w:styleId="Heading5Char">
+    <w:name w:val="Heading 5 Char"/>
+    <w:basedOn w:val="DefaultParagraphFont"/>
+    <w:link w:val="Heading5"/>
     <w:uiPriority w:val="9"/>
     <w:semiHidden/>
     <w:rsid w:val="00FA2433"/>
@@ -2153,10 +2684,10 @@
       <w:color w:val="0F4761" w:themeColor="accent1" w:themeShade="BF"/>
     </w:rPr>
   </w:style>
-  <w:style w:type="character" w:customStyle="1" w:styleId="berschrift6Zchn">
-    <w:name w:val="Überschrift 6 Zchn"/>
-    <w:basedOn w:val="Absatz-Standardschriftart"/>
-    <w:link w:val="berschrift6"/>
+  <w:style w:type="character" w:customStyle="1" w:styleId="Heading6Char">
+    <w:name w:val="Heading 6 Char"/>
+    <w:basedOn w:val="DefaultParagraphFont"/>
+    <w:link w:val="Heading6"/>
     <w:uiPriority w:val="9"/>
     <w:semiHidden/>
     <w:rsid w:val="00FA2433"/>
@@ -2167,10 +2698,10 @@
       <w:color w:val="595959" w:themeColor="text1" w:themeTint="A6"/>
     </w:rPr>
   </w:style>
-  <w:style w:type="character" w:customStyle="1" w:styleId="berschrift7Zchn">
-    <w:name w:val="Überschrift 7 Zchn"/>
-    <w:basedOn w:val="Absatz-Standardschriftart"/>
-    <w:link w:val="berschrift7"/>
+  <w:style w:type="character" w:customStyle="1" w:styleId="Heading7Char">
+    <w:name w:val="Heading 7 Char"/>
+    <w:basedOn w:val="DefaultParagraphFont"/>
+    <w:link w:val="Heading7"/>
     <w:uiPriority w:val="9"/>
     <w:semiHidden/>
     <w:rsid w:val="00FA2433"/>
@@ -2179,10 +2710,10 @@
       <w:color w:val="595959" w:themeColor="text1" w:themeTint="A6"/>
     </w:rPr>
   </w:style>
-  <w:style w:type="character" w:customStyle="1" w:styleId="berschrift8Zchn">
-    <w:name w:val="Überschrift 8 Zchn"/>
-    <w:basedOn w:val="Absatz-Standardschriftart"/>
-    <w:link w:val="berschrift8"/>
+  <w:style w:type="character" w:customStyle="1" w:styleId="Heading8Char">
+    <w:name w:val="Heading 8 Char"/>
+    <w:basedOn w:val="DefaultParagraphFont"/>
+    <w:link w:val="Heading8"/>
     <w:uiPriority w:val="9"/>
     <w:semiHidden/>
     <w:rsid w:val="00FA2433"/>
@@ -2193,10 +2724,10 @@
       <w:color w:val="272727" w:themeColor="text1" w:themeTint="D8"/>
     </w:rPr>
   </w:style>
-  <w:style w:type="character" w:customStyle="1" w:styleId="berschrift9Zchn">
-    <w:name w:val="Überschrift 9 Zchn"/>
-    <w:basedOn w:val="Absatz-Standardschriftart"/>
-    <w:link w:val="berschrift9"/>
+  <w:style w:type="character" w:customStyle="1" w:styleId="Heading9Char">
+    <w:name w:val="Heading 9 Char"/>
+    <w:basedOn w:val="DefaultParagraphFont"/>
+    <w:link w:val="Heading9"/>
     <w:uiPriority w:val="9"/>
     <w:semiHidden/>
     <w:rsid w:val="00FA2433"/>
@@ -2205,11 +2736,11 @@
       <w:color w:val="272727" w:themeColor="text1" w:themeTint="D8"/>
     </w:rPr>
   </w:style>
-  <w:style w:type="paragraph" w:styleId="Titel">
+  <w:style w:type="paragraph" w:styleId="Title">
     <w:name w:val="Title"/>
-    <w:basedOn w:val="Standard"/>
-    <w:next w:val="Standard"/>
-    <w:link w:val="TitelZchn"/>
+    <w:basedOn w:val="Normal"/>
+    <w:next w:val="Normal"/>
+    <w:link w:val="TitleChar"/>
     <w:uiPriority w:val="10"/>
     <w:qFormat/>
     <w:rsid w:val="00FA2433"/>
@@ -2225,10 +2756,10 @@
       <w:szCs w:val="56"/>
     </w:rPr>
   </w:style>
-  <w:style w:type="character" w:customStyle="1" w:styleId="TitelZchn">
-    <w:name w:val="Titel Zchn"/>
-    <w:basedOn w:val="Absatz-Standardschriftart"/>
-    <w:link w:val="Titel"/>
+  <w:style w:type="character" w:customStyle="1" w:styleId="TitleChar">
+    <w:name w:val="Title Char"/>
+    <w:basedOn w:val="DefaultParagraphFont"/>
+    <w:link w:val="Title"/>
     <w:uiPriority w:val="10"/>
     <w:rsid w:val="00FA2433"/>
     <w:rPr>
@@ -2239,11 +2770,11 @@
       <w:szCs w:val="56"/>
     </w:rPr>
   </w:style>
-  <w:style w:type="paragraph" w:styleId="Untertitel">
+  <w:style w:type="paragraph" w:styleId="Subtitle">
     <w:name w:val="Subtitle"/>
-    <w:basedOn w:val="Standard"/>
-    <w:next w:val="Standard"/>
-    <w:link w:val="UntertitelZchn"/>
+    <w:basedOn w:val="Normal"/>
+    <w:next w:val="Normal"/>
+    <w:link w:val="SubtitleChar"/>
     <w:uiPriority w:val="11"/>
     <w:qFormat/>
     <w:rsid w:val="00FA2433"/>
@@ -2260,10 +2791,10 @@
       <w:szCs w:val="28"/>
     </w:rPr>
   </w:style>
-  <w:style w:type="character" w:customStyle="1" w:styleId="UntertitelZchn">
-    <w:name w:val="Untertitel Zchn"/>
-    <w:basedOn w:val="Absatz-Standardschriftart"/>
-    <w:link w:val="Untertitel"/>
+  <w:style w:type="character" w:customStyle="1" w:styleId="SubtitleChar">
+    <w:name w:val="Subtitle Char"/>
+    <w:basedOn w:val="DefaultParagraphFont"/>
+    <w:link w:val="Subtitle"/>
     <w:uiPriority w:val="11"/>
     <w:rsid w:val="00FA2433"/>
     <w:rPr>
@@ -2274,11 +2805,11 @@
       <w:szCs w:val="28"/>
     </w:rPr>
   </w:style>
-  <w:style w:type="paragraph" w:styleId="Zitat">
+  <w:style w:type="paragraph" w:styleId="Quote">
     <w:name w:val="Quote"/>
-    <w:basedOn w:val="Standard"/>
-    <w:next w:val="Standard"/>
-    <w:link w:val="ZitatZchn"/>
+    <w:basedOn w:val="Normal"/>
+    <w:next w:val="Normal"/>
+    <w:link w:val="QuoteChar"/>
     <w:uiPriority w:val="29"/>
     <w:qFormat/>
     <w:rsid w:val="00FA2433"/>
@@ -2292,10 +2823,10 @@
       <w:color w:val="404040" w:themeColor="text1" w:themeTint="BF"/>
     </w:rPr>
   </w:style>
-  <w:style w:type="character" w:customStyle="1" w:styleId="ZitatZchn">
-    <w:name w:val="Zitat Zchn"/>
-    <w:basedOn w:val="Absatz-Standardschriftart"/>
-    <w:link w:val="Zitat"/>
+  <w:style w:type="character" w:customStyle="1" w:styleId="QuoteChar">
+    <w:name w:val="Quote Char"/>
+    <w:basedOn w:val="DefaultParagraphFont"/>
+    <w:link w:val="Quote"/>
     <w:uiPriority w:val="29"/>
     <w:rsid w:val="00FA2433"/>
     <w:rPr>
@@ -2304,9 +2835,9 @@
       <w:color w:val="404040" w:themeColor="text1" w:themeTint="BF"/>
     </w:rPr>
   </w:style>
-  <w:style w:type="paragraph" w:styleId="Listenabsatz">
+  <w:style w:type="paragraph" w:styleId="ListParagraph">
     <w:name w:val="List Paragraph"/>
-    <w:basedOn w:val="Standard"/>
+    <w:basedOn w:val="Normal"/>
     <w:uiPriority w:val="34"/>
     <w:qFormat/>
     <w:rsid w:val="00FA2433"/>
@@ -2315,9 +2846,9 @@
       <w:contextualSpacing/>
     </w:pPr>
   </w:style>
-  <w:style w:type="character" w:styleId="IntensiveHervorhebung">
+  <w:style w:type="character" w:styleId="IntenseEmphasis">
     <w:name w:val="Intense Emphasis"/>
-    <w:basedOn w:val="Absatz-Standardschriftart"/>
+    <w:basedOn w:val="DefaultParagraphFont"/>
     <w:uiPriority w:val="21"/>
     <w:qFormat/>
     <w:rsid w:val="00FA2433"/>
@@ -2327,11 +2858,11 @@
       <w:color w:val="0F4761" w:themeColor="accent1" w:themeShade="BF"/>
     </w:rPr>
   </w:style>
-  <w:style w:type="paragraph" w:styleId="IntensivesZitat">
+  <w:style w:type="paragraph" w:styleId="IntenseQuote">
     <w:name w:val="Intense Quote"/>
-    <w:basedOn w:val="Standard"/>
-    <w:next w:val="Standard"/>
-    <w:link w:val="IntensivesZitatZchn"/>
+    <w:basedOn w:val="Normal"/>
+    <w:next w:val="Normal"/>
+    <w:link w:val="IntenseQuoteChar"/>
     <w:uiPriority w:val="30"/>
     <w:qFormat/>
     <w:rsid w:val="00FA2433"/>
@@ -2350,10 +2881,10 @@
       <w:color w:val="0F4761" w:themeColor="accent1" w:themeShade="BF"/>
     </w:rPr>
   </w:style>
-  <w:style w:type="character" w:customStyle="1" w:styleId="IntensivesZitatZchn">
-    <w:name w:val="Intensives Zitat Zchn"/>
-    <w:basedOn w:val="Absatz-Standardschriftart"/>
-    <w:link w:val="IntensivesZitat"/>
+  <w:style w:type="character" w:customStyle="1" w:styleId="IntenseQuoteChar">
+    <w:name w:val="Intense Quote Char"/>
+    <w:basedOn w:val="DefaultParagraphFont"/>
+    <w:link w:val="IntenseQuote"/>
     <w:uiPriority w:val="30"/>
     <w:rsid w:val="00FA2433"/>
     <w:rPr>
@@ -2362,9 +2893,9 @@
       <w:color w:val="0F4761" w:themeColor="accent1" w:themeShade="BF"/>
     </w:rPr>
   </w:style>
-  <w:style w:type="character" w:styleId="IntensiverVerweis">
+  <w:style w:type="character" w:styleId="IntenseReference">
     <w:name w:val="Intense Reference"/>
-    <w:basedOn w:val="Absatz-Standardschriftart"/>
+    <w:basedOn w:val="DefaultParagraphFont"/>
     <w:uiPriority w:val="32"/>
     <w:qFormat/>
     <w:rsid w:val="00FA2433"/>
@@ -2692,4 +3223,213 @@
     </a:ext>
   </a:extLst>
 </a:theme>
+</file>
+
+<file path=customXml/item1.xml><?xml version="1.0" encoding="utf-8"?>
+<ct:contentTypeSchema xmlns:ct="http://schemas.microsoft.com/office/2006/metadata/contentType" xmlns:ma="http://schemas.microsoft.com/office/2006/metadata/properties/metaAttributes" ct:_="" ma:_="" ma:contentTypeName="Dokument" ma:contentTypeID="0x0101008BFE5113E4A91D45A0EE45E419D76E0D" ma:contentTypeVersion="6" ma:contentTypeDescription="Ein neues Dokument erstellen." ma:contentTypeScope="" ma:versionID="cd354e42612ec816ba3b7a2502b45878">
+  <xsd:schema xmlns:xsd="http://www.w3.org/2001/XMLSchema" xmlns:xs="http://www.w3.org/2001/XMLSchema" xmlns:p="http://schemas.microsoft.com/office/2006/metadata/properties" xmlns:ns3="aab7531d-7fc8-4e8f-b54c-d06c1268d33f" targetNamespace="http://schemas.microsoft.com/office/2006/metadata/properties" ma:root="true" ma:fieldsID="424c9adab335b46ce6ad1ac0fc097ebd" ns3:_="">
+    <xsd:import namespace="aab7531d-7fc8-4e8f-b54c-d06c1268d33f"/>
+    <xsd:element name="properties">
+      <xsd:complexType>
+        <xsd:sequence>
+          <xsd:element name="documentManagement">
+            <xsd:complexType>
+              <xsd:all>
+                <xsd:element ref="ns3:MediaServiceDateTaken" minOccurs="0"/>
+                <xsd:element ref="ns3:MediaServiceMetadata" minOccurs="0"/>
+                <xsd:element ref="ns3:MediaServiceFastMetadata" minOccurs="0"/>
+                <xsd:element ref="ns3:MediaServiceSearchProperties" minOccurs="0"/>
+                <xsd:element ref="ns3:MediaServiceObjectDetectorVersions" minOccurs="0"/>
+                <xsd:element ref="ns3:_activity" minOccurs="0"/>
+              </xsd:all>
+            </xsd:complexType>
+          </xsd:element>
+        </xsd:sequence>
+      </xsd:complexType>
+    </xsd:element>
+  </xsd:schema>
+  <xsd:schema xmlns:xsd="http://www.w3.org/2001/XMLSchema" xmlns:xs="http://www.w3.org/2001/XMLSchema" xmlns:dms="http://schemas.microsoft.com/office/2006/documentManagement/types" xmlns:pc="http://schemas.microsoft.com/office/infopath/2007/PartnerControls" targetNamespace="aab7531d-7fc8-4e8f-b54c-d06c1268d33f" elementFormDefault="qualified">
+    <xsd:import namespace="http://schemas.microsoft.com/office/2006/documentManagement/types"/>
+    <xsd:import namespace="http://schemas.microsoft.com/office/infopath/2007/PartnerControls"/>
+    <xsd:element name="MediaServiceDateTaken" ma:index="8" nillable="true" ma:displayName="MediaServiceDateTaken" ma:hidden="true" ma:indexed="true" ma:internalName="MediaServiceDateTaken" ma:readOnly="true">
+      <xsd:simpleType>
+        <xsd:restriction base="dms:Text"/>
+      </xsd:simpleType>
+    </xsd:element>
+    <xsd:element name="MediaServiceMetadata" ma:index="9" nillable="true" ma:displayName="MediaServiceMetadata" ma:hidden="true" ma:internalName="MediaServiceMetadata" ma:readOnly="true">
+      <xsd:simpleType>
+        <xsd:restriction base="dms:Note"/>
+      </xsd:simpleType>
+    </xsd:element>
+    <xsd:element name="MediaServiceFastMetadata" ma:index="10" nillable="true" ma:displayName="MediaServiceFastMetadata" ma:hidden="true" ma:internalName="MediaServiceFastMetadata" ma:readOnly="true">
+      <xsd:simpleType>
+        <xsd:restriction base="dms:Note"/>
+      </xsd:simpleType>
+    </xsd:element>
+    <xsd:element name="MediaServiceSearchProperties" ma:index="11" nillable="true" ma:displayName="MediaServiceSearchProperties" ma:hidden="true" ma:internalName="MediaServiceSearchProperties" ma:readOnly="true">
+      <xsd:simpleType>
+        <xsd:restriction base="dms:Note"/>
+      </xsd:simpleType>
+    </xsd:element>
+    <xsd:element name="MediaServiceObjectDetectorVersions" ma:index="12" nillable="true" ma:displayName="MediaServiceObjectDetectorVersions" ma:hidden="true" ma:indexed="true" ma:internalName="MediaServiceObjectDetectorVersions" ma:readOnly="true">
+      <xsd:simpleType>
+        <xsd:restriction base="dms:Text"/>
+      </xsd:simpleType>
+    </xsd:element>
+    <xsd:element name="_activity" ma:index="13" nillable="true" ma:displayName="_activity" ma:hidden="true" ma:internalName="_activity">
+      <xsd:simpleType>
+        <xsd:restriction base="dms:Note"/>
+      </xsd:simpleType>
+    </xsd:element>
+  </xsd:schema>
+  <xsd:schema xmlns="http://schemas.openxmlformats.org/package/2006/metadata/core-properties" xmlns:xsd="http://www.w3.org/2001/XMLSchema" xmlns:xsi="http://www.w3.org/2001/XMLSchema-instance" xmlns:dc="http://purl.org/dc/elements/1.1/" xmlns:dcterms="http://purl.org/dc/terms/" xmlns:odoc="http://schemas.microsoft.com/internal/obd" targetNamespace="http://schemas.openxmlformats.org/package/2006/metadata/core-properties" elementFormDefault="qualified" attributeFormDefault="unqualified" blockDefault="#all">
+    <xsd:import namespace="http://purl.org/dc/elements/1.1/" schemaLocation="http://dublincore.org/schemas/xmls/qdc/2003/04/02/dc.xsd"/>
+    <xsd:import namespace="http://purl.org/dc/terms/" schemaLocation="http://dublincore.org/schemas/xmls/qdc/2003/04/02/dcterms.xsd"/>
+    <xsd:element name="coreProperties" type="CT_coreProperties"/>
+    <xsd:complexType name="CT_coreProperties">
+      <xsd:all>
+        <xsd:element ref="dc:creator" minOccurs="0" maxOccurs="1"/>
+        <xsd:element ref="dcterms:created" minOccurs="0" maxOccurs="1"/>
+        <xsd:element ref="dc:identifier" minOccurs="0" maxOccurs="1"/>
+        <xsd:element name="contentType" minOccurs="0" maxOccurs="1" type="xsd:string" ma:index="0" ma:displayName="Inhaltstyp"/>
+        <xsd:element ref="dc:title" minOccurs="0" maxOccurs="1" ma:index="4" ma:displayName="Titel"/>
+        <xsd:element ref="dc:subject" minOccurs="0" maxOccurs="1"/>
+        <xsd:element ref="dc:description" minOccurs="0" maxOccurs="1"/>
+        <xsd:element name="keywords" minOccurs="0" maxOccurs="1" type="xsd:string"/>
+        <xsd:element ref="dc:language" minOccurs="0" maxOccurs="1"/>
+        <xsd:element name="category" minOccurs="0" maxOccurs="1" type="xsd:string"/>
+        <xsd:element name="version" minOccurs="0" maxOccurs="1" type="xsd:string"/>
+        <xsd:element name="revision" minOccurs="0" maxOccurs="1" type="xsd:string">
+          <xsd:annotation>
+            <xsd:documentation>
+                        This value indicates the number of saves or revisions. The application is responsible for updating this value after each revision.
+                    </xsd:documentation>
+          </xsd:annotation>
+        </xsd:element>
+        <xsd:element name="lastModifiedBy" minOccurs="0" maxOccurs="1" type="xsd:string"/>
+        <xsd:element ref="dcterms:modified" minOccurs="0" maxOccurs="1"/>
+        <xsd:element name="contentStatus" minOccurs="0" maxOccurs="1" type="xsd:string"/>
+      </xsd:all>
+    </xsd:complexType>
+  </xsd:schema>
+  <xs:schema xmlns:pc="http://schemas.microsoft.com/office/infopath/2007/PartnerControls" xmlns:xs="http://www.w3.org/2001/XMLSchema" targetNamespace="http://schemas.microsoft.com/office/infopath/2007/PartnerControls" elementFormDefault="qualified" attributeFormDefault="unqualified">
+    <xs:element name="Person">
+      <xs:complexType>
+        <xs:sequence>
+          <xs:element ref="pc:DisplayName" minOccurs="0"/>
+          <xs:element ref="pc:AccountId" minOccurs="0"/>
+          <xs:element ref="pc:AccountType" minOccurs="0"/>
+        </xs:sequence>
+      </xs:complexType>
+    </xs:element>
+    <xs:element name="DisplayName" type="xs:string"/>
+    <xs:element name="AccountId" type="xs:string"/>
+    <xs:element name="AccountType" type="xs:string"/>
+    <xs:element name="BDCAssociatedEntity">
+      <xs:complexType>
+        <xs:sequence>
+          <xs:element ref="pc:BDCEntity" minOccurs="0" maxOccurs="unbounded"/>
+        </xs:sequence>
+        <xs:attribute ref="pc:EntityNamespace"/>
+        <xs:attribute ref="pc:EntityName"/>
+        <xs:attribute ref="pc:SystemInstanceName"/>
+        <xs:attribute ref="pc:AssociationName"/>
+      </xs:complexType>
+    </xs:element>
+    <xs:attribute name="EntityNamespace" type="xs:string"/>
+    <xs:attribute name="EntityName" type="xs:string"/>
+    <xs:attribute name="SystemInstanceName" type="xs:string"/>
+    <xs:attribute name="AssociationName" type="xs:string"/>
+    <xs:element name="BDCEntity">
+      <xs:complexType>
+        <xs:sequence>
+          <xs:element ref="pc:EntityDisplayName" minOccurs="0"/>
+          <xs:element ref="pc:EntityInstanceReference" minOccurs="0"/>
+          <xs:element ref="pc:EntityId1" minOccurs="0"/>
+          <xs:element ref="pc:EntityId2" minOccurs="0"/>
+          <xs:element ref="pc:EntityId3" minOccurs="0"/>
+          <xs:element ref="pc:EntityId4" minOccurs="0"/>
+          <xs:element ref="pc:EntityId5" minOccurs="0"/>
+        </xs:sequence>
+      </xs:complexType>
+    </xs:element>
+    <xs:element name="EntityDisplayName" type="xs:string"/>
+    <xs:element name="EntityInstanceReference" type="xs:string"/>
+    <xs:element name="EntityId1" type="xs:string"/>
+    <xs:element name="EntityId2" type="xs:string"/>
+    <xs:element name="EntityId3" type="xs:string"/>
+    <xs:element name="EntityId4" type="xs:string"/>
+    <xs:element name="EntityId5" type="xs:string"/>
+    <xs:element name="Terms">
+      <xs:complexType>
+        <xs:sequence>
+          <xs:element ref="pc:TermInfo" minOccurs="0" maxOccurs="unbounded"/>
+        </xs:sequence>
+      </xs:complexType>
+    </xs:element>
+    <xs:element name="TermInfo">
+      <xs:complexType>
+        <xs:sequence>
+          <xs:element ref="pc:TermName" minOccurs="0"/>
+          <xs:element ref="pc:TermId" minOccurs="0"/>
+        </xs:sequence>
+      </xs:complexType>
+    </xs:element>
+    <xs:element name="TermName" type="xs:string"/>
+    <xs:element name="TermId" type="xs:string"/>
+  </xs:schema>
+</ct:contentTypeSchema>
+</file>
+
+<file path=customXml/item2.xml><?xml version="1.0" encoding="utf-8"?>
+<p:properties xmlns:p="http://schemas.microsoft.com/office/2006/metadata/properties" xmlns:xsi="http://www.w3.org/2001/XMLSchema-instance" xmlns:pc="http://schemas.microsoft.com/office/infopath/2007/PartnerControls">
+  <documentManagement>
+    <_activity xmlns="aab7531d-7fc8-4e8f-b54c-d06c1268d33f" xsi:nil="true"/>
+  </documentManagement>
+</p:properties>
+</file>
+
+<file path=customXml/item3.xml><?xml version="1.0" encoding="utf-8"?>
+<?mso-contentType ?>
+<FormTemplates xmlns="http://schemas.microsoft.com/sharepoint/v3/contenttype/forms">
+  <Display>DocumentLibraryForm</Display>
+  <Edit>DocumentLibraryForm</Edit>
+  <New>DocumentLibraryForm</New>
+</FormTemplates>
+</file>
+
+<file path=customXml/itemProps1.xml><?xml version="1.0" encoding="utf-8"?>
+<ds:datastoreItem xmlns:ds="http://schemas.openxmlformats.org/officeDocument/2006/customXml" ds:itemID="{EB41761B-448D-4524-9588-A86FE198F0EB}">
+  <ds:schemaRefs>
+    <ds:schemaRef ds:uri="http://schemas.microsoft.com/office/2006/metadata/contentType"/>
+    <ds:schemaRef ds:uri="http://schemas.microsoft.com/office/2006/metadata/properties/metaAttributes"/>
+    <ds:schemaRef ds:uri="http://www.w3.org/2001/XMLSchema"/>
+    <ds:schemaRef ds:uri="http://schemas.microsoft.com/office/2006/metadata/properties"/>
+    <ds:schemaRef ds:uri="aab7531d-7fc8-4e8f-b54c-d06c1268d33f"/>
+    <ds:schemaRef ds:uri="http://schemas.microsoft.com/office/2006/documentManagement/types"/>
+    <ds:schemaRef ds:uri="http://schemas.microsoft.com/office/infopath/2007/PartnerControls"/>
+    <ds:schemaRef ds:uri="http://schemas.openxmlformats.org/package/2006/metadata/core-properties"/>
+    <ds:schemaRef ds:uri="http://purl.org/dc/elements/1.1/"/>
+    <ds:schemaRef ds:uri="http://purl.org/dc/terms/"/>
+    <ds:schemaRef ds:uri="http://schemas.microsoft.com/internal/obd"/>
+  </ds:schemaRefs>
+</ds:datastoreItem>
+</file>
+
+<file path=customXml/itemProps2.xml><?xml version="1.0" encoding="utf-8"?>
+<ds:datastoreItem xmlns:ds="http://schemas.openxmlformats.org/officeDocument/2006/customXml" ds:itemID="{2C23BF33-AAE6-4461-AA14-3049E337616A}">
+  <ds:schemaRefs>
+    <ds:schemaRef ds:uri="http://schemas.microsoft.com/office/2006/metadata/properties"/>
+    <ds:schemaRef ds:uri="http://schemas.microsoft.com/office/infopath/2007/PartnerControls"/>
+    <ds:schemaRef ds:uri="aab7531d-7fc8-4e8f-b54c-d06c1268d33f"/>
+  </ds:schemaRefs>
+</ds:datastoreItem>
+</file>
+
+<file path=customXml/itemProps3.xml><?xml version="1.0" encoding="utf-8"?>
+<ds:datastoreItem xmlns:ds="http://schemas.openxmlformats.org/officeDocument/2006/customXml" ds:itemID="{A34FC95C-8093-4DB9-89EC-A77801B8C0A9}">
+  <ds:schemaRefs>
+    <ds:schemaRef ds:uri="http://schemas.microsoft.com/sharepoint/v3/contenttype/forms"/>
+  </ds:schemaRefs>
+</ds:datastoreItem>
 </file>
</xml_diff>